<commit_message>
docs: Fix domain typo in report - app.mejoraok.com
</commit_message>
<xml_diff>
--- a/Documents/mejoraapp+2026-04-20.docx
+++ b/Documents/mejoraapp+2026-04-20.docx
@@ -43,7 +43,7 @@
         <w:br/>
         <w:t>Repositorio: github.com/pabloeckert/mejoraapp</w:t>
         <w:br/>
-        <w:t>Dominio de producción: app.mejioraok.com</w:t>
+        <w:t>Dominio de producción: app.mejoraok.com</w:t>
         <w:br/>
         <w:t>Clasificación: CONFIDENCIAL — Solo uso interno</w:t>
       </w:r>
@@ -236,7 +236,7 @@
         <w:spacing w:before="20" w:after="20"/>
       </w:pPr>
       <w:r>
-        <w:t>✅ Dominio personalizado app.mejioraok.com configurado.</w:t>
+        <w:t>✅ Dominio personalizado app.mejoraok.com configurado.</w:t>
       </w:r>
     </w:p>
     <w:p>
@@ -8035,7 +8035,7 @@
     </w:p>
     <w:p>
       <w:r>
-        <w:t>Producción completa con sistema de pagos, membresías activas, moderación integral, y todas las funcionalidades core operativas. Dominio: app.mejioraok.com</w:t>
+        <w:t>Producción completa con sistema de pagos, membresías activas, moderación integral, y todas las funcionalidades core operativas. Dominio: app.mejoraok.com</w:t>
       </w:r>
     </w:p>
     <w:p>
@@ -9538,7 +9538,7 @@
     </w:p>
     <w:p>
       <w:r>
-        <w:t>El subdominio de producción está configurado: app.mejioraok.com</w:t>
+        <w:t>El subdominio de producción está configurado: app.mejoraok.com</w:t>
         <w:br/>
         <w:t>La app está lista para desplegar con el dominio personalizado una vez completados los sprints de seguridad y monetización del roadmap.</w:t>
       </w:r>

</xml_diff>